<commit_message>
\fix: safer nested loops in V3 docx template"
</commit_message>
<xml_diff>
--- a/backend/feedbacks/utils/template_truong_tu_chinh_v3.docx
+++ b/backend/feedbacks/utils/template_truong_tu_chinh_v3.docx
@@ -2,40 +2,6 @@
 <file path=word/document.xml><?xml version="1.0" encoding="utf-8"?>
 <w:document xmlns:wpc="http://schemas.microsoft.com/office/word/2010/wordprocessingCanvas" xmlns:mo="http://schemas.microsoft.com/office/mac/office/2008/main" xmlns:mc="http://schemas.openxmlformats.org/markup-compatibility/2006" xmlns:mv="urn:schemas-microsoft-com:mac:vml" xmlns:o="urn:schemas-microsoft-com:office:office" xmlns:r="http://schemas.openxmlformats.org/officeDocument/2006/relationships" xmlns:m="http://schemas.openxmlformats.org/officeDocument/2006/math" xmlns:v="urn:schemas-microsoft-com:vml" xmlns:wp14="http://schemas.microsoft.com/office/word/2010/wordprocessingDrawing" xmlns:wp="http://schemas.openxmlformats.org/drawingml/2006/wordprocessingDrawing" xmlns:w10="urn:schemas-microsoft-com:office:word" xmlns:w="http://schemas.openxmlformats.org/wordprocessingml/2006/main" xmlns:w14="http://schemas.microsoft.com/office/word/2010/wordml" xmlns:wpg="http://schemas.microsoft.com/office/word/2010/wordprocessingGroup" xmlns:wpi="http://schemas.microsoft.com/office/word/2010/wordprocessingInk" xmlns:wne="http://schemas.microsoft.com/office/word/2006/wordml" xmlns:wps="http://schemas.microsoft.com/office/word/2010/wordprocessingShape" mc:Ignorable="w14 wp14">
   <w:body>
-    <w:tbl>
-      <w:tblPr>
-        <w:tblW w:type="auto" w:w="0"/>
-        <w:tblLayout w:type="autofit"/>
-        <w:tblLook w:firstColumn="1" w:firstRow="1" w:lastColumn="0" w:lastRow="0" w:noHBand="0" w:noVBand="1" w:val="04A0"/>
-      </w:tblPr>
-      <w:tblGrid>
-        <w:gridCol w:w="6120"/>
-        <w:gridCol w:w="6120"/>
-      </w:tblGrid>
-      <w:tr>
-        <w:tc>
-          <w:tcPr>
-            <w:tcW w:type="dxa" w:w="6120"/>
-          </w:tcPr>
-          <w:p>
-            <w:r>
-              <w:t>{{ drafting_agency }}\nSố: ....../BC-......</w:t>
-            </w:r>
-          </w:p>
-        </w:tc>
-        <w:tc>
-          <w:tcPr>
-            <w:tcW w:type="dxa" w:w="6120"/>
-          </w:tcPr>
-          <w:p>
-            <w:r>
-              <w:t>CỘNG HÒA XÃ HỘI CHỦ NGHĨA VIỆT NAM\nĐộc lập - Tự do - Hạnh phúc\n-------------------\n{{ agency_location }}, {{ export_date }}</w:t>
-            </w:r>
-          </w:p>
-        </w:tc>
-      </w:tr>
-    </w:tbl>
-    <w:p/>
     <w:p>
       <w:pPr>
         <w:jc w:val="center"/>
@@ -45,17 +11,12 @@
           <w:b/>
           <w:sz w:val="28"/>
         </w:rPr>
-        <w:t>BÁO CÁO TỔNG HỢP Ý KIẾN GÓP Ý\n{{ document_title }}</w:t>
+        <w:t>BÁO CÁO TỔNG HỢP Ý KIẾN (V3)</w:t>
       </w:r>
     </w:p>
     <w:p>
       <w:r>
-        <w:t>Tổng số cơ quan gửi ý kiến: {{ total_consulted }}</w:t>
-      </w:r>
-    </w:p>
-    <w:p>
-      <w:r>
-        <w:t>Tổng số ý kiến nhận được: {{ total_feedbacks }}</w:t>
+        <w:t>Dự thảo: {{ document_title }}</w:t>
       </w:r>
     </w:p>
     <w:tbl>
@@ -80,6 +41,9 @@
           </w:tcPr>
           <w:p>
             <w:r>
+              <w:rPr>
+                <w:b/>
+              </w:rPr>
               <w:t>STT</w:t>
             </w:r>
           </w:p>
@@ -90,6 +54,9 @@
           </w:tcPr>
           <w:p>
             <w:r>
+              <w:rPr>
+                <w:b/>
+              </w:rPr>
               <w:t>Điều/Khoản</w:t>
             </w:r>
           </w:p>
@@ -100,6 +67,9 @@
           </w:tcPr>
           <w:p>
             <w:r>
+              <w:rPr>
+                <w:b/>
+              </w:rPr>
               <w:t>Cơ quan góp ý</w:t>
             </w:r>
           </w:p>
@@ -110,6 +80,9 @@
           </w:tcPr>
           <w:p>
             <w:r>
+              <w:rPr>
+                <w:b/>
+              </w:rPr>
               <w:t>Nội dung góp ý</w:t>
             </w:r>
           </w:p>
@@ -120,6 +93,9 @@
           </w:tcPr>
           <w:p>
             <w:r>
+              <w:rPr>
+                <w:b/>
+              </w:rPr>
               <w:t>Nội dung giải trình</w:t>
             </w:r>
           </w:p>
@@ -130,6 +106,9 @@
           </w:tcPr>
           <w:p>
             <w:r>
+              <w:rPr>
+                <w:b/>
+              </w:rPr>
               <w:t>Chuyên viên</w:t>
             </w:r>
           </w:p>
@@ -140,6 +119,9 @@
           </w:tcPr>
           <w:p>
             <w:r>
+              <w:rPr>
+                <w:b/>
+              </w:rPr>
               <w:t>Trạng thái</w:t>
             </w:r>
           </w:p>
@@ -215,7 +197,7 @@
           </w:tcPr>
           <w:p>
             <w:r>
-              <w:t>{% for ex in fb.explanations %}{{ ex.content }}{% endfor %}</w:t>
+              <w:t>{% for ex in fb.explanations %}- {{ ex.content }}{% endfor %}</w:t>
             </w:r>
           </w:p>
         </w:tc>
@@ -235,7 +217,20 @@
           </w:tcPr>
           <w:p>
             <w:r>
-              <w:t>{{ fb.status }}{% endfor %}{% endfor %}</w:t>
+              <w:t>{{ fb.status }}{% endfor %}</w:t>
+            </w:r>
+          </w:p>
+        </w:tc>
+      </w:tr>
+      <w:tr>
+        <w:tc>
+          <w:tcPr>
+            <w:tcW w:type="dxa" w:w="12243"/>
+            <w:gridSpan w:val="7"/>
+          </w:tcPr>
+          <w:p>
+            <w:r>
+              <w:t>{% endfor %}</w:t>
             </w:r>
           </w:p>
         </w:tc>

</xml_diff>

<commit_message>
\fix: use tr for loops in V3 template to solve unknown tag endfor"
</commit_message>
<xml_diff>
--- a/backend/feedbacks/utils/template_truong_tu_chinh_v3.docx
+++ b/backend/feedbacks/utils/template_truong_tu_chinh_v3.docx
@@ -11,7 +11,7 @@
           <w:b/>
           <w:sz w:val="28"/>
         </w:rPr>
-        <w:t>BÁO CÁO TỔNG HỢP Ý KIẾN (V3)</w:t>
+        <w:t>BÁO CÁO TỔNG HỢP Ý KIẾN (V3 - TR)</w:t>
       </w:r>
     </w:p>
     <w:p>
@@ -134,7 +134,7 @@
           </w:tcPr>
           <w:p>
             <w:r>
-              <w:t>{% for d in dieu_list %}</w:t>
+              <w:t>{% tr for d in dieu_list %}</w:t>
             </w:r>
           </w:p>
         </w:tc>
@@ -157,7 +157,7 @@
           </w:tcPr>
           <w:p>
             <w:r>
-              <w:t>{% for fb in d.feedbacks %}{{ fb.stt }}</w:t>
+              <w:t>{% tr for fb in d.feedbacks %}{{ fb.stt }}</w:t>
             </w:r>
           </w:p>
         </w:tc>
@@ -197,7 +197,9 @@
           </w:tcPr>
           <w:p>
             <w:r>
-              <w:t>{% for ex in fb.explanations %}- {{ ex.content }}{% endfor %}</w:t>
+              <w:t>{% for ex in fb.explanations %}- {{ ex.content }}</w:t>
+              <w:br/>
+              <w:t>{% endfor %}</w:t>
             </w:r>
           </w:p>
         </w:tc>
@@ -217,7 +219,7 @@
           </w:tcPr>
           <w:p>
             <w:r>
-              <w:t>{{ fb.status }}{% endfor %}</w:t>
+              <w:t>{{ fb.status }}{% tr endfor %}</w:t>
             </w:r>
           </w:p>
         </w:tc>
@@ -230,7 +232,7 @@
           </w:tcPr>
           <w:p>
             <w:r>
-              <w:t>{% endfor %}</w:t>
+              <w:t>{% tr endfor %}</w:t>
             </w:r>
           </w:p>
         </w:tc>

</xml_diff>

<commit_message>
\fix: final simple V3 template without nested loops"
</commit_message>
<xml_diff>
--- a/backend/feedbacks/utils/template_truong_tu_chinh_v3.docx
+++ b/backend/feedbacks/utils/template_truong_tu_chinh_v3.docx
@@ -11,7 +11,7 @@
           <w:b/>
           <w:sz w:val="28"/>
         </w:rPr>
-        <w:t>BÁO CÁO TỔNG HỢP Ý KIẾN (V3 - TR)</w:t>
+        <w:t>BÁO CÁO TỔNG HỢP Ý KIẾN (V3 - FINAL)</w:t>
       </w:r>
     </w:p>
     <w:p>
@@ -134,7 +134,7 @@
           </w:tcPr>
           <w:p>
             <w:r>
-              <w:t>{% tr for d in dieu_list %}</w:t>
+              <w:t>{% for d in dieu_list %}</w:t>
             </w:r>
           </w:p>
         </w:tc>
@@ -157,7 +157,7 @@
           </w:tcPr>
           <w:p>
             <w:r>
-              <w:t>{% tr for fb in d.feedbacks %}{{ fb.stt }}</w:t>
+              <w:t>{% for fb in d.feedbacks %}{{ fb.stt }}</w:t>
             </w:r>
           </w:p>
         </w:tc>
@@ -197,9 +197,7 @@
           </w:tcPr>
           <w:p>
             <w:r>
-              <w:t>{% for ex in fb.explanations %}- {{ ex.content }}</w:t>
-              <w:br/>
-              <w:t>{% endfor %}</w:t>
+              <w:t>{{ fb.explanation_str }}</w:t>
             </w:r>
           </w:p>
         </w:tc>
@@ -219,7 +217,7 @@
           </w:tcPr>
           <w:p>
             <w:r>
-              <w:t>{{ fb.status }}{% tr endfor %}</w:t>
+              <w:t>{{ fb.status }}{% endfor %}</w:t>
             </w:r>
           </w:p>
         </w:tc>
@@ -232,7 +230,7 @@
           </w:tcPr>
           <w:p>
             <w:r>
-              <w:t>{% tr endfor %}</w:t>
+              <w:t>{% endfor %}</w:t>
             </w:r>
           </w:p>
         </w:tc>

</xml_diff>

<commit_message>
\fix: ultra clean V3 template layout without redundant header row"
</commit_message>
<xml_diff>
--- a/backend/feedbacks/utils/template_truong_tu_chinh_v3.docx
+++ b/backend/feedbacks/utils/template_truong_tu_chinh_v3.docx
@@ -11,7 +11,7 @@
           <w:b/>
           <w:sz w:val="28"/>
         </w:rPr>
-        <w:t>BÁO CÁO TỔNG HỢP Ý KIẾN (V3 - FINAL)</w:t>
+        <w:t>BÁO CÁO TỔNG HỢP Ý KIẾN</w:t>
       </w:r>
     </w:p>
     <w:p>
@@ -134,30 +134,7 @@
           </w:tcPr>
           <w:p>
             <w:r>
-              <w:t>{% for d in dieu_list %}</w:t>
-            </w:r>
-          </w:p>
-        </w:tc>
-        <w:tc>
-          <w:tcPr>
-            <w:tcW w:type="dxa" w:w="10494"/>
-            <w:gridSpan w:val="6"/>
-          </w:tcPr>
-          <w:p>
-            <w:r>
-              <w:t>{{ d.node_label }}</w:t>
-            </w:r>
-          </w:p>
-        </w:tc>
-      </w:tr>
-      <w:tr>
-        <w:tc>
-          <w:tcPr>
-            <w:tcW w:type="dxa" w:w="1749"/>
-          </w:tcPr>
-          <w:p>
-            <w:r>
-              <w:t>{% for fb in d.feedbacks %}{{ fb.stt }}</w:t>
+              <w:t>{% for d in dieu_list %}{% for fb in d.feedbacks %}{{ fb.stt }}</w:t>
             </w:r>
           </w:p>
         </w:tc>
@@ -217,20 +194,7 @@
           </w:tcPr>
           <w:p>
             <w:r>
-              <w:t>{{ fb.status }}{% endfor %}</w:t>
-            </w:r>
-          </w:p>
-        </w:tc>
-      </w:tr>
-      <w:tr>
-        <w:tc>
-          <w:tcPr>
-            <w:tcW w:type="dxa" w:w="12243"/>
-            <w:gridSpan w:val="7"/>
-          </w:tcPr>
-          <w:p>
-            <w:r>
-              <w:t>{% endfor %}</w:t>
+              <w:t>{{ fb.status }}{% endfor %}{% endfor %}</w:t>
             </w:r>
           </w:p>
         </w:tc>

</xml_diff>